<commit_message>
feat: soporte multi-plantilla Jumbo y Éxito 80mm, visor térmico y generación masiva con rebobinado de IDs
</commit_message>
<xml_diff>
--- a/plantillas_base/JUMBO.docx
+++ b/plantillas_base/JUMBO.docx
@@ -4,10 +4,27 @@
   <w:body>
     <w:p>
       <w:pPr>
+        <w:spacing w:after="0" w:line="240" w:lineRule="auto"/>
+        <w:ind w:left="-142"/>
+        <w:jc w:val="center"/>
+        <w:rPr>
+          <w:rFonts w:eastAsia="Arial Unicode MS" w:cstheme="minorHAnsi"/>
+          <w:b/>
+          <w:noProof/>
+          <w:color w:val="171717" w:themeColor="background2" w:themeShade="1A"/>
+          <w:sz w:val="16"/>
+          <w:szCs w:val="16"/>
+          <w:lang w:eastAsia="es-CO"/>
+        </w:rPr>
+      </w:pPr>
+    </w:p>
+    <w:p>
+      <w:pPr>
         <w:tabs>
           <w:tab w:val="left" w:pos="2790"/>
         </w:tabs>
         <w:spacing w:after="0" w:line="240" w:lineRule="auto"/>
+        <w:ind w:left="-142"/>
         <w:jc w:val="both"/>
         <w:rPr>
           <w:rFonts w:eastAsia="Yu Gothic UI Light" w:cstheme="minorHAnsi"/>
@@ -20,14 +37,20 @@
       </w:pPr>
       <w:r>
         <w:rPr>
-          <w:sz w:val="16"/>
-        </w:rPr>
-        <w:t>CENCOSUD  COLOMBIA   S.A      NIT {{ emisor_nit }}</w:t>
-      </w:r>
-    </w:p>
-    <w:p>
-      <w:pPr>
-        <w:spacing w:after="0" w:line="240" w:lineRule="auto"/>
+          <w:rFonts w:eastAsia="Yu Gothic UI Light" w:cstheme="minorHAnsi"/>
+          <w:noProof/>
+          <w:color w:val="171717" w:themeColor="background2" w:themeShade="1A"/>
+          <w:sz w:val="16"/>
+          <w:szCs w:val="16"/>
+          <w:lang w:eastAsia="es-CO"/>
+        </w:rPr>
+        <w:t>CENCOSUD  COLOMBIA   S.A      NIT 900.155.107-1</w:t>
+      </w:r>
+    </w:p>
+    <w:p>
+      <w:pPr>
+        <w:spacing w:after="0" w:line="240" w:lineRule="auto"/>
+        <w:ind w:left="-142"/>
         <w:rPr>
           <w:rFonts w:eastAsia="Yu Gothic UI Light" w:cstheme="minorHAnsi"/>
           <w:noProof/>
@@ -52,6 +75,7 @@
     <w:p>
       <w:pPr>
         <w:spacing w:after="0" w:line="240" w:lineRule="auto"/>
+        <w:ind w:left="-142"/>
         <w:rPr>
           <w:rFonts w:eastAsia="Yu Gothic UI Light" w:cstheme="minorHAnsi"/>
           <w:noProof/>
@@ -76,6 +100,7 @@
     <w:p>
       <w:pPr>
         <w:spacing w:after="0" w:line="240" w:lineRule="auto"/>
+        <w:ind w:left="-142"/>
         <w:rPr>
           <w:rFonts w:eastAsia="Yu Gothic UI Light" w:cstheme="minorHAnsi"/>
           <w:noProof/>
@@ -100,6 +125,7 @@
     <w:p>
       <w:pPr>
         <w:spacing w:after="0" w:line="240" w:lineRule="auto"/>
+        <w:ind w:left="-142"/>
         <w:rPr>
           <w:rFonts w:eastAsia="Yu Gothic UI Light" w:cstheme="minorHAnsi"/>
           <w:noProof/>
@@ -124,6 +150,7 @@
     <w:p>
       <w:pPr>
         <w:spacing w:after="0" w:line="240" w:lineRule="auto"/>
+        <w:ind w:left="-142"/>
         <w:rPr>
           <w:rFonts w:eastAsia="Yu Gothic UI Light" w:cstheme="minorHAnsi"/>
           <w:noProof/>
@@ -148,6 +175,7 @@
     <w:p>
       <w:pPr>
         <w:spacing w:after="0" w:line="240" w:lineRule="auto"/>
+        <w:ind w:left="-142"/>
         <w:rPr>
           <w:rFonts w:eastAsia="Yu Gothic UI Light" w:cstheme="minorHAnsi"/>
           <w:noProof/>
@@ -172,6 +200,7 @@
     <w:p>
       <w:pPr>
         <w:spacing w:after="0" w:line="240" w:lineRule="auto"/>
+        <w:ind w:left="-142"/>
         <w:rPr>
           <w:rFonts w:eastAsia="Yu Gothic UI Light" w:cstheme="minorHAnsi"/>
           <w:noProof/>
@@ -196,25 +225,45 @@
     <w:p>
       <w:pPr>
         <w:spacing w:after="0" w:line="240" w:lineRule="auto"/>
-        <w:rPr>
-          <w:rFonts w:eastAsia="Yu Gothic UI Light" w:cstheme="minorHAnsi"/>
-          <w:noProof/>
-          <w:color w:val="171717" w:themeColor="background2" w:themeShade="1A"/>
-          <w:sz w:val="16"/>
-          <w:szCs w:val="16"/>
-          <w:lang w:eastAsia="es-CO"/>
-        </w:rPr>
-      </w:pPr>
-      <w:r>
-        <w:rPr>
-          <w:sz w:val="16"/>
-        </w:rPr>
-        <w:t xml:space="preserve">                              {{ sucursal }} </w:t>
-      </w:r>
-    </w:p>
-    <w:p>
-      <w:pPr>
-        <w:spacing w:after="0" w:line="240" w:lineRule="auto"/>
+        <w:ind w:left="-142"/>
+        <w:rPr>
+          <w:rFonts w:eastAsia="Yu Gothic UI Light" w:cstheme="minorHAnsi"/>
+          <w:noProof/>
+          <w:color w:val="171717" w:themeColor="background2" w:themeShade="1A"/>
+          <w:sz w:val="16"/>
+          <w:szCs w:val="16"/>
+          <w:highlight w:val="yellow"/>
+          <w:lang w:eastAsia="es-CO"/>
+        </w:rPr>
+      </w:pPr>
+      <w:r>
+        <w:rPr>
+          <w:rFonts w:eastAsia="Yu Gothic UI Light" w:cstheme="minorHAnsi"/>
+          <w:noProof/>
+          <w:color w:val="171717" w:themeColor="background2" w:themeShade="1A"/>
+          <w:sz w:val="16"/>
+          <w:szCs w:val="16"/>
+          <w:lang w:eastAsia="es-CO"/>
+        </w:rPr>
+        <w:t xml:space="preserve">                              </w:t>
+      </w:r>
+      <w:r>
+        <w:rPr>
+          <w:rFonts w:eastAsia="Yu Gothic UI Light" w:cstheme="minorHAnsi"/>
+          <w:noProof/>
+          <w:color w:val="171717" w:themeColor="background2" w:themeShade="1A"/>
+          <w:sz w:val="16"/>
+          <w:szCs w:val="16"/>
+          <w:highlight w:val="yellow"/>
+          <w:lang w:eastAsia="es-CO"/>
+        </w:rPr>
+        <w:t xml:space="preserve">JUMBO SANTA FE - MEDELLIN </w:t>
+      </w:r>
+    </w:p>
+    <w:p>
+      <w:pPr>
+        <w:spacing w:after="0" w:line="240" w:lineRule="auto"/>
+        <w:ind w:left="-142"/>
         <w:jc w:val="center"/>
         <w:rPr>
           <w:rFonts w:eastAsia="Yu Gothic UI Light" w:cstheme="minorHAnsi"/>
@@ -227,14 +276,21 @@
       </w:pPr>
       <w:r>
         <w:rPr>
-          <w:sz w:val="16"/>
-        </w:rPr>
-        <w:t>{{ emisor_direccion }}    Tel   :  {{ emisor_telefono }}</w:t>
-      </w:r>
-    </w:p>
-    <w:p>
-      <w:pPr>
-        <w:spacing w:after="0" w:line="240" w:lineRule="auto"/>
+          <w:rFonts w:eastAsia="Yu Gothic UI Light" w:cstheme="minorHAnsi"/>
+          <w:noProof/>
+          <w:color w:val="171717" w:themeColor="background2" w:themeShade="1A"/>
+          <w:sz w:val="16"/>
+          <w:szCs w:val="16"/>
+          <w:highlight w:val="yellow"/>
+          <w:lang w:eastAsia="es-CO"/>
+        </w:rPr>
+        <w:t>AV   EL POBLADO CRA 43A    Tel   :  6045013012</w:t>
+      </w:r>
+    </w:p>
+    <w:p>
+      <w:pPr>
+        <w:spacing w:after="0" w:line="240" w:lineRule="auto"/>
+        <w:ind w:left="-142"/>
         <w:rPr>
           <w:rFonts w:eastAsia="Yu Gothic UI Light" w:cstheme="minorHAnsi"/>
           <w:noProof/>
@@ -259,6 +315,7 @@
     <w:p>
       <w:pPr>
         <w:spacing w:after="0" w:line="240" w:lineRule="auto"/>
+        <w:ind w:left="-142"/>
         <w:rPr>
           <w:rFonts w:eastAsia="Yu Gothic UI Light" w:cstheme="minorHAnsi"/>
           <w:b/>
@@ -285,6 +342,7 @@
     <w:p>
       <w:pPr>
         <w:spacing w:after="0" w:line="240" w:lineRule="auto"/>
+        <w:ind w:left="-142"/>
         <w:rPr>
           <w:rFonts w:eastAsia="Yu Gothic UI Light" w:cstheme="minorHAnsi"/>
           <w:b/>
@@ -311,95 +369,79 @@
     <w:p>
       <w:pPr>
         <w:spacing w:after="0" w:line="240" w:lineRule="auto"/>
-        <w:rPr>
-          <w:rFonts w:eastAsia="Yu Gothic UI Light" w:cstheme="minorHAnsi"/>
-          <w:noProof/>
-          <w:color w:val="171717" w:themeColor="background2" w:themeShade="1A"/>
-          <w:sz w:val="16"/>
-          <w:szCs w:val="16"/>
-          <w:lang w:eastAsia="es-CO"/>
-        </w:rPr>
-      </w:pPr>
-      <w:r>
-        <w:rPr>
-          <w:sz w:val="16"/>
-        </w:rPr>
-        <w:t>{{ productos_bloque }}</w:t>
-      </w:r>
-    </w:p>
-    <w:p>
-      <w:pPr>
-        <w:spacing w:after="0" w:line="240" w:lineRule="auto"/>
-        <w:rPr>
-          <w:rFonts w:eastAsia="Yu Gothic UI Light" w:cstheme="minorHAnsi"/>
-          <w:noProof/>
-          <w:color w:val="171717" w:themeColor="background2" w:themeShade="1A"/>
-          <w:sz w:val="16"/>
-          <w:szCs w:val="16"/>
-          <w:lang w:eastAsia="es-CO"/>
-        </w:rPr>
-      </w:pPr>
-      <w:r>
-        <w:rPr>
-          <w:sz w:val="16"/>
-        </w:rPr>
-      </w:r>
-    </w:p>
-    <w:p>
-      <w:pPr>
-        <w:spacing w:after="0" w:line="240" w:lineRule="auto"/>
-        <w:rPr>
-          <w:rFonts w:eastAsia="Yu Gothic UI Light" w:cstheme="minorHAnsi"/>
-          <w:noProof/>
-          <w:color w:val="171717" w:themeColor="background2" w:themeShade="1A"/>
-          <w:sz w:val="16"/>
-          <w:szCs w:val="16"/>
-          <w:lang w:eastAsia="es-CO"/>
-        </w:rPr>
-      </w:pPr>
-      <w:r>
-        <w:rPr>
-          <w:sz w:val="16"/>
-        </w:rPr>
-      </w:r>
-    </w:p>
-    <w:p>
-      <w:pPr>
-        <w:spacing w:after="0" w:line="240" w:lineRule="auto"/>
-        <w:rPr>
-          <w:rFonts w:eastAsia="Yu Gothic UI Light" w:cstheme="minorHAnsi"/>
-          <w:noProof/>
-          <w:color w:val="171717" w:themeColor="background2" w:themeShade="1A"/>
-          <w:sz w:val="16"/>
-          <w:szCs w:val="16"/>
-          <w:lang w:eastAsia="es-CO"/>
-        </w:rPr>
-      </w:pPr>
-      <w:r>
-        <w:rPr>
-          <w:sz w:val="16"/>
-        </w:rPr>
-      </w:r>
-    </w:p>
-    <w:p>
-      <w:pPr>
-        <w:spacing w:after="0" w:line="240" w:lineRule="auto"/>
-        <w:rPr>
-          <w:rFonts w:eastAsia="Yu Gothic UI Light" w:cstheme="minorHAnsi"/>
-          <w:noProof/>
-          <w:color w:val="171717" w:themeColor="background2" w:themeShade="1A"/>
-          <w:sz w:val="16"/>
-          <w:szCs w:val="16"/>
-          <w:lang w:eastAsia="es-CO"/>
-        </w:rPr>
-      </w:pPr>
-      <w:r>
-        <w:rPr>
-          <w:rFonts w:eastAsia="Yu Gothic UI Light" w:cstheme="minorHAnsi"/>
-          <w:noProof/>
-          <w:color w:val="171717" w:themeColor="background2" w:themeShade="1A"/>
-          <w:sz w:val="16"/>
-          <w:szCs w:val="16"/>
+        <w:ind w:left="-142"/>
+        <w:rPr>
+          <w:rFonts w:eastAsia="Yu Gothic UI Light" w:cstheme="minorHAnsi"/>
+          <w:noProof/>
+          <w:color w:val="171717" w:themeColor="background2" w:themeShade="1A"/>
+          <w:sz w:val="16"/>
+          <w:szCs w:val="16"/>
+          <w:highlight w:val="yellow"/>
+          <w:lang w:eastAsia="es-CO"/>
+        </w:rPr>
+      </w:pPr>
+      <w:r>
+        <w:rPr>
+          <w:rFonts w:eastAsia="Yu Gothic UI Light" w:cstheme="minorHAnsi"/>
+          <w:noProof/>
+          <w:color w:val="171717" w:themeColor="background2" w:themeShade="1A"/>
+          <w:sz w:val="16"/>
+          <w:szCs w:val="16"/>
+          <w:highlight w:val="yellow"/>
+          <w:lang w:eastAsia="es-CO"/>
+        </w:rPr>
+        <w:t>3  X 14.550</w:t>
+      </w:r>
+    </w:p>
+    <w:p>
+      <w:pPr>
+        <w:spacing w:after="0" w:line="240" w:lineRule="auto"/>
+        <w:ind w:left="-142"/>
+        <w:rPr>
+          <w:rFonts w:eastAsia="Yu Gothic UI Light" w:cstheme="minorHAnsi"/>
+          <w:noProof/>
+          <w:color w:val="171717" w:themeColor="background2" w:themeShade="1A"/>
+          <w:sz w:val="16"/>
+          <w:szCs w:val="16"/>
+          <w:highlight w:val="yellow"/>
+          <w:lang w:eastAsia="es-CO"/>
+        </w:rPr>
+      </w:pPr>
+      <w:r>
+        <w:rPr>
+          <w:rFonts w:eastAsia="Yu Gothic UI Light" w:cstheme="minorHAnsi"/>
+          <w:noProof/>
+          <w:color w:val="171717" w:themeColor="background2" w:themeShade="1A"/>
+          <w:sz w:val="16"/>
+          <w:szCs w:val="16"/>
+          <w:highlight w:val="yellow"/>
+          <w:lang w:eastAsia="es-CO"/>
+        </w:rPr>
+        <w:t xml:space="preserve">3669368 Jugo hit surtido pg 10 lev.12 200ml c-u      $43.650                                                               </w:t>
+      </w:r>
+    </w:p>
+    <w:p>
+      <w:pPr>
+        <w:spacing w:after="0" w:line="240" w:lineRule="auto"/>
+        <w:ind w:left="-142"/>
+        <w:rPr>
+          <w:rFonts w:eastAsia="Yu Gothic UI Light" w:cstheme="minorHAnsi"/>
+          <w:noProof/>
+          <w:color w:val="171717" w:themeColor="background2" w:themeShade="1A"/>
+          <w:sz w:val="16"/>
+          <w:szCs w:val="16"/>
+          <w:highlight w:val="yellow"/>
+          <w:lang w:eastAsia="es-CO"/>
+        </w:rPr>
+      </w:pPr>
+      <w:r>
+        <w:rPr>
+          <w:rFonts w:eastAsia="Yu Gothic UI Light" w:cstheme="minorHAnsi"/>
+          <w:noProof/>
+          <w:color w:val="171717" w:themeColor="background2" w:themeShade="1A"/>
+          <w:sz w:val="16"/>
+          <w:szCs w:val="16"/>
+          <w:highlight w:val="yellow"/>
           <w:lang w:eastAsia="es-CO"/>
         </w:rPr>
         <w:t xml:space="preserve">      </w:t>
@@ -408,22 +450,25 @@
     <w:p>
       <w:pPr>
         <w:spacing w:after="0" w:line="240" w:lineRule="auto"/>
-        <w:rPr>
-          <w:rFonts w:eastAsia="Yu Gothic UI Light" w:cstheme="minorHAnsi"/>
-          <w:noProof/>
-          <w:color w:val="171717" w:themeColor="background2" w:themeShade="1A"/>
-          <w:sz w:val="16"/>
-          <w:szCs w:val="16"/>
-          <w:lang w:eastAsia="es-CO"/>
-        </w:rPr>
-      </w:pPr>
-      <w:r>
-        <w:rPr>
-          <w:rFonts w:eastAsia="Yu Gothic UI Light" w:cstheme="minorHAnsi"/>
-          <w:noProof/>
-          <w:color w:val="171717" w:themeColor="background2" w:themeShade="1A"/>
-          <w:sz w:val="16"/>
-          <w:szCs w:val="16"/>
+        <w:ind w:left="-142"/>
+        <w:rPr>
+          <w:rFonts w:eastAsia="Yu Gothic UI Light" w:cstheme="minorHAnsi"/>
+          <w:noProof/>
+          <w:color w:val="171717" w:themeColor="background2" w:themeShade="1A"/>
+          <w:sz w:val="16"/>
+          <w:szCs w:val="16"/>
+          <w:highlight w:val="yellow"/>
+          <w:lang w:eastAsia="es-CO"/>
+        </w:rPr>
+      </w:pPr>
+      <w:r>
+        <w:rPr>
+          <w:rFonts w:eastAsia="Yu Gothic UI Light" w:cstheme="minorHAnsi"/>
+          <w:noProof/>
+          <w:color w:val="171717" w:themeColor="background2" w:themeShade="1A"/>
+          <w:sz w:val="16"/>
+          <w:szCs w:val="16"/>
+          <w:highlight w:val="yellow"/>
           <w:lang w:eastAsia="es-CO"/>
         </w:rPr>
         <w:t>--------------------------------------------------------------------------------</w:t>
@@ -432,15 +477,29 @@
     <w:p>
       <w:pPr>
         <w:spacing w:after="0" w:line="240" w:lineRule="auto"/>
-        <w:rPr>
-          <w:rFonts w:eastAsia="Yu Gothic UI Light" w:cstheme="minorHAnsi"/>
-          <w:noProof/>
-          <w:color w:val="171717" w:themeColor="background2" w:themeShade="1A"/>
-          <w:sz w:val="16"/>
-          <w:szCs w:val="16"/>
-          <w:lang w:eastAsia="es-CO"/>
-        </w:rPr>
-      </w:pPr>
+        <w:ind w:left="-142"/>
+        <w:rPr>
+          <w:rFonts w:eastAsia="Yu Gothic UI Light" w:cstheme="minorHAnsi"/>
+          <w:noProof/>
+          <w:color w:val="171717" w:themeColor="background2" w:themeShade="1A"/>
+          <w:sz w:val="16"/>
+          <w:szCs w:val="16"/>
+          <w:highlight w:val="yellow"/>
+          <w:lang w:eastAsia="es-CO"/>
+        </w:rPr>
+      </w:pPr>
+      <w:r>
+        <w:rPr>
+          <w:rFonts w:eastAsia="Yu Gothic UI Light" w:cstheme="minorHAnsi"/>
+          <w:noProof/>
+          <w:color w:val="171717" w:themeColor="background2" w:themeShade="1A"/>
+          <w:sz w:val="16"/>
+          <w:szCs w:val="16"/>
+          <w:highlight w:val="yellow"/>
+          <w:lang w:eastAsia="es-CO"/>
+        </w:rPr>
+        <w:t xml:space="preserve">                 </w:t>
+      </w:r>
       <m:oMath>
         <m:r>
           <w:rPr>
@@ -449,6 +508,7 @@
             <w:color w:val="171717" w:themeColor="background2" w:themeShade="1A"/>
             <w:sz w:val="16"/>
             <w:szCs w:val="16"/>
+            <w:highlight w:val="yellow"/>
             <w:lang w:eastAsia="es-CO"/>
           </w:rPr>
           <m:t>****</m:t>
@@ -456,108 +516,151 @@
       </m:oMath>
       <w:r>
         <w:rPr>
-          <w:sz w:val="16"/>
-        </w:rPr>
-        <w:t xml:space="preserve">                   SUBTOTAL/TOTAL                         {{ subtotal_total_fmt }}</w:t>
-      </w:r>
-    </w:p>
-    <w:p>
-      <w:pPr>
-        <w:spacing w:after="0" w:line="240" w:lineRule="auto"/>
-        <w:rPr>
-          <w:rFonts w:eastAsia="Yu Gothic UI Light" w:cstheme="minorHAnsi"/>
-          <w:noProof/>
-          <w:color w:val="171717" w:themeColor="background2" w:themeShade="1A"/>
-          <w:sz w:val="16"/>
-          <w:szCs w:val="16"/>
-          <w:lang w:eastAsia="es-CO"/>
-        </w:rPr>
-      </w:pPr>
-      <w:r>
-        <w:rPr>
-          <w:rFonts w:eastAsia="Yu Gothic UI Light" w:cstheme="minorHAnsi"/>
-          <w:noProof/>
-          <w:color w:val="171717" w:themeColor="background2" w:themeShade="1A"/>
-          <w:sz w:val="16"/>
-          <w:szCs w:val="16"/>
-          <w:lang w:eastAsia="es-CO"/>
-        </w:rPr>
-        <w:t>--------------------------------------------------------------------------------</w:t>
-      </w:r>
-    </w:p>
-    <w:p>
-      <w:pPr>
-        <w:spacing w:after="0" w:line="240" w:lineRule="auto"/>
-        <w:rPr>
-          <w:rFonts w:eastAsia="Yu Gothic UI Light" w:cstheme="minorHAnsi"/>
-          <w:noProof/>
-          <w:color w:val="171717" w:themeColor="background2" w:themeShade="1A"/>
-          <w:sz w:val="16"/>
-          <w:szCs w:val="16"/>
-          <w:lang w:eastAsia="es-CO"/>
-        </w:rPr>
-      </w:pPr>
-      <w:r>
-        <w:rPr>
-          <w:sz w:val="16"/>
-        </w:rPr>
-        <w:t>{{ forma_pago_linea }}</w:t>
-      </w:r>
-    </w:p>
-    <w:p>
-      <w:pPr>
-        <w:spacing w:after="0" w:line="240" w:lineRule="auto"/>
-        <w:rPr>
-          <w:rFonts w:eastAsia="Yu Gothic UI Light" w:cstheme="minorHAnsi"/>
-          <w:noProof/>
-          <w:color w:val="171717" w:themeColor="background2" w:themeShade="1A"/>
-          <w:sz w:val="16"/>
-          <w:szCs w:val="16"/>
-          <w:lang w:eastAsia="es-CO"/>
-        </w:rPr>
-      </w:pPr>
-      <w:r>
-        <w:rPr>
-          <w:sz w:val="16"/>
-        </w:rPr>
-        <w:t>CAMBIO{{ espacios_cambio }}{{ cambio_fmt }}</w:t>
-      </w:r>
-    </w:p>
-    <w:p>
-      <w:pPr>
-        <w:spacing w:after="0" w:line="240" w:lineRule="auto"/>
-        <w:rPr>
-          <w:rFonts w:eastAsia="Yu Gothic UI Light" w:cstheme="minorHAnsi"/>
-          <w:noProof/>
-          <w:color w:val="171717" w:themeColor="background2" w:themeShade="1A"/>
-          <w:sz w:val="16"/>
-          <w:szCs w:val="16"/>
-          <w:lang w:eastAsia="es-CO"/>
-        </w:rPr>
-      </w:pPr>
-    </w:p>
-    <w:p>
-      <w:pPr>
-        <w:spacing w:after="0" w:line="240" w:lineRule="auto"/>
-        <w:rPr>
-          <w:rFonts w:eastAsia="Yu Gothic UI Light" w:cstheme="minorHAnsi"/>
-          <w:noProof/>
-          <w:color w:val="171717" w:themeColor="background2" w:themeShade="1A"/>
-          <w:sz w:val="16"/>
-          <w:szCs w:val="16"/>
-          <w:lang w:eastAsia="es-CO"/>
-        </w:rPr>
-      </w:pPr>
-      <w:r>
-        <w:rPr>
-          <w:sz w:val="16"/>
-        </w:rPr>
-        <w:t xml:space="preserve">            ITEMS   COMPRADOS  : {{ items_comprados }}</w:t>
-      </w:r>
-    </w:p>
-    <w:p>
-      <w:pPr>
-        <w:spacing w:after="0" w:line="240" w:lineRule="auto"/>
+          <w:rFonts w:eastAsia="Yu Gothic UI Light" w:cstheme="minorHAnsi"/>
+          <w:noProof/>
+          <w:color w:val="171717" w:themeColor="background2" w:themeShade="1A"/>
+          <w:sz w:val="16"/>
+          <w:szCs w:val="16"/>
+          <w:highlight w:val="yellow"/>
+          <w:lang w:eastAsia="es-CO"/>
+        </w:rPr>
+        <w:t xml:space="preserve">  SUBTOTAL/TOTAL                                  43.650</w:t>
+      </w:r>
+    </w:p>
+    <w:p>
+      <w:pPr>
+        <w:spacing w:after="0" w:line="240" w:lineRule="auto"/>
+        <w:ind w:left="-142"/>
+        <w:rPr>
+          <w:rFonts w:eastAsia="Yu Gothic UI Light" w:cstheme="minorHAnsi"/>
+          <w:noProof/>
+          <w:color w:val="171717" w:themeColor="background2" w:themeShade="1A"/>
+          <w:sz w:val="16"/>
+          <w:szCs w:val="16"/>
+          <w:highlight w:val="yellow"/>
+          <w:lang w:eastAsia="es-CO"/>
+        </w:rPr>
+      </w:pPr>
+      <w:r>
+        <w:rPr>
+          <w:rFonts w:eastAsia="Yu Gothic UI Light" w:cstheme="minorHAnsi"/>
+          <w:noProof/>
+          <w:color w:val="171717" w:themeColor="background2" w:themeShade="1A"/>
+          <w:sz w:val="16"/>
+          <w:szCs w:val="16"/>
+          <w:highlight w:val="yellow"/>
+          <w:lang w:eastAsia="es-CO"/>
+        </w:rPr>
+        <w:t xml:space="preserve">-------------------------------------------------------------------------------- </w:t>
+      </w:r>
+    </w:p>
+    <w:p>
+      <w:pPr>
+        <w:spacing w:after="0" w:line="240" w:lineRule="auto"/>
+        <w:ind w:left="-142"/>
+        <w:rPr>
+          <w:rFonts w:eastAsia="Yu Gothic UI Light" w:cstheme="minorHAnsi"/>
+          <w:noProof/>
+          <w:color w:val="171717" w:themeColor="background2" w:themeShade="1A"/>
+          <w:sz w:val="16"/>
+          <w:szCs w:val="16"/>
+          <w:highlight w:val="yellow"/>
+          <w:lang w:eastAsia="es-CO"/>
+        </w:rPr>
+      </w:pPr>
+      <w:r>
+        <w:rPr>
+          <w:rFonts w:eastAsia="Yu Gothic UI Light" w:cstheme="minorHAnsi"/>
+          <w:noProof/>
+          <w:color w:val="171717" w:themeColor="background2" w:themeShade="1A"/>
+          <w:sz w:val="16"/>
+          <w:szCs w:val="16"/>
+          <w:highlight w:val="yellow"/>
+          <w:lang w:eastAsia="es-CO"/>
+        </w:rPr>
+        <w:t>EFECTIVO                                                                             50.000</w:t>
+      </w:r>
+    </w:p>
+    <w:p>
+      <w:pPr>
+        <w:spacing w:after="0" w:line="240" w:lineRule="auto"/>
+        <w:ind w:left="-142"/>
+        <w:rPr>
+          <w:rFonts w:eastAsia="Yu Gothic UI Light" w:cstheme="minorHAnsi"/>
+          <w:noProof/>
+          <w:color w:val="171717" w:themeColor="background2" w:themeShade="1A"/>
+          <w:sz w:val="16"/>
+          <w:szCs w:val="16"/>
+          <w:lang w:eastAsia="es-CO"/>
+        </w:rPr>
+      </w:pPr>
+      <w:r>
+        <w:rPr>
+          <w:rFonts w:eastAsia="Yu Gothic UI Light" w:cstheme="minorHAnsi"/>
+          <w:noProof/>
+          <w:color w:val="171717" w:themeColor="background2" w:themeShade="1A"/>
+          <w:sz w:val="16"/>
+          <w:szCs w:val="16"/>
+          <w:highlight w:val="yellow"/>
+          <w:lang w:eastAsia="es-CO"/>
+        </w:rPr>
+        <w:t>CAMBIO                                                                                 6.350</w:t>
+      </w:r>
+    </w:p>
+    <w:p>
+      <w:pPr>
+        <w:spacing w:after="0" w:line="240" w:lineRule="auto"/>
+        <w:ind w:left="-142"/>
+        <w:rPr>
+          <w:rFonts w:eastAsia="Yu Gothic UI Light" w:cstheme="minorHAnsi"/>
+          <w:noProof/>
+          <w:color w:val="171717" w:themeColor="background2" w:themeShade="1A"/>
+          <w:sz w:val="16"/>
+          <w:szCs w:val="16"/>
+          <w:lang w:eastAsia="es-CO"/>
+        </w:rPr>
+      </w:pPr>
+    </w:p>
+    <w:p>
+      <w:pPr>
+        <w:spacing w:after="0" w:line="240" w:lineRule="auto"/>
+        <w:ind w:left="-142"/>
+        <w:rPr>
+          <w:rFonts w:eastAsia="Yu Gothic UI Light" w:cstheme="minorHAnsi"/>
+          <w:noProof/>
+          <w:color w:val="171717" w:themeColor="background2" w:themeShade="1A"/>
+          <w:sz w:val="16"/>
+          <w:szCs w:val="16"/>
+          <w:lang w:eastAsia="es-CO"/>
+        </w:rPr>
+      </w:pPr>
+      <w:r>
+        <w:rPr>
+          <w:rFonts w:eastAsia="Yu Gothic UI Light" w:cstheme="minorHAnsi"/>
+          <w:noProof/>
+          <w:color w:val="171717" w:themeColor="background2" w:themeShade="1A"/>
+          <w:sz w:val="16"/>
+          <w:szCs w:val="16"/>
+          <w:lang w:eastAsia="es-CO"/>
+        </w:rPr>
+        <w:t xml:space="preserve">            ITEMS   COMPRADOS  : </w:t>
+      </w:r>
+      <w:r>
+        <w:rPr>
+          <w:rFonts w:eastAsia="Yu Gothic UI Light" w:cstheme="minorHAnsi"/>
+          <w:noProof/>
+          <w:color w:val="171717" w:themeColor="background2" w:themeShade="1A"/>
+          <w:sz w:val="16"/>
+          <w:szCs w:val="16"/>
+          <w:lang w:eastAsia="es-CO"/>
+        </w:rPr>
+        <w:t>1</w:t>
+      </w:r>
+    </w:p>
+    <w:p>
+      <w:pPr>
+        <w:spacing w:after="0" w:line="240" w:lineRule="auto"/>
+        <w:ind w:left="-142"/>
         <w:rPr>
           <w:rFonts w:eastAsia="Yu Gothic UI Light" w:cstheme="minorHAnsi"/>
           <w:noProof/>
@@ -582,6 +685,7 @@
     <w:p>
       <w:pPr>
         <w:spacing w:after="0" w:line="240" w:lineRule="auto"/>
+        <w:ind w:left="-142"/>
         <w:rPr>
           <w:rFonts w:eastAsia="Yu Gothic UI Light" w:cstheme="minorHAnsi"/>
           <w:noProof/>
@@ -606,25 +710,99 @@
     <w:p>
       <w:pPr>
         <w:spacing w:after="0" w:line="240" w:lineRule="auto"/>
-        <w:rPr>
-          <w:rFonts w:eastAsia="Yu Gothic UI Light" w:cstheme="minorHAnsi"/>
-          <w:noProof/>
-          <w:color w:val="171717" w:themeColor="background2" w:themeShade="1A"/>
-          <w:sz w:val="16"/>
-          <w:szCs w:val="16"/>
-          <w:lang w:eastAsia="es-CO"/>
-        </w:rPr>
-      </w:pPr>
-      <w:r>
-        <w:rPr>
-          <w:sz w:val="16"/>
-        </w:rPr>
-        <w:t>{{ impuesto_linea }}</w:t>
-      </w:r>
-    </w:p>
-    <w:p>
-      <w:pPr>
-        <w:spacing w:after="0" w:line="240" w:lineRule="auto"/>
+        <w:ind w:left="-142"/>
+        <w:rPr>
+          <w:rFonts w:eastAsia="Yu Gothic UI Light" w:cstheme="minorHAnsi"/>
+          <w:noProof/>
+          <w:color w:val="171717" w:themeColor="background2" w:themeShade="1A"/>
+          <w:sz w:val="16"/>
+          <w:szCs w:val="16"/>
+          <w:lang w:eastAsia="es-CO"/>
+        </w:rPr>
+      </w:pPr>
+      <w:r>
+        <w:rPr>
+          <w:rFonts w:eastAsia="Yu Gothic UI Light" w:cstheme="minorHAnsi"/>
+          <w:noProof/>
+          <w:color w:val="171717" w:themeColor="background2" w:themeShade="1A"/>
+          <w:sz w:val="16"/>
+          <w:szCs w:val="16"/>
+          <w:lang w:eastAsia="es-CO"/>
+        </w:rPr>
+        <w:t>N=</w:t>
+      </w:r>
+      <w:r>
+        <w:rPr>
+          <w:rFonts w:eastAsia="Yu Gothic UI Light" w:cstheme="minorHAnsi"/>
+          <w:noProof/>
+          <w:color w:val="171717" w:themeColor="background2" w:themeShade="1A"/>
+          <w:sz w:val="16"/>
+          <w:szCs w:val="16"/>
+          <w:lang w:eastAsia="es-CO"/>
+        </w:rPr>
+        <w:t>19</w:t>
+      </w:r>
+      <w:r>
+        <w:rPr>
+          <w:rFonts w:eastAsia="Yu Gothic UI Light" w:cstheme="minorHAnsi"/>
+          <w:noProof/>
+          <w:color w:val="171717" w:themeColor="background2" w:themeShade="1A"/>
+          <w:sz w:val="16"/>
+          <w:szCs w:val="16"/>
+          <w:lang w:eastAsia="es-CO"/>
+        </w:rPr>
+        <w:t>%</w:t>
+      </w:r>
+      <w:r>
+        <w:rPr>
+          <w:rFonts w:eastAsia="Yu Gothic UI Light" w:cstheme="minorHAnsi"/>
+          <w:noProof/>
+          <w:color w:val="171717" w:themeColor="background2" w:themeShade="1A"/>
+          <w:sz w:val="16"/>
+          <w:szCs w:val="16"/>
+          <w:lang w:eastAsia="es-CO"/>
+        </w:rPr>
+        <w:t xml:space="preserve"> </w:t>
+      </w:r>
+      <w:r>
+        <w:rPr>
+          <w:rFonts w:eastAsia="Yu Gothic UI Light" w:cstheme="minorHAnsi"/>
+          <w:noProof/>
+          <w:color w:val="171717" w:themeColor="background2" w:themeShade="1A"/>
+          <w:sz w:val="16"/>
+          <w:szCs w:val="16"/>
+          <w:lang w:eastAsia="es-CO"/>
+        </w:rPr>
+        <w:t xml:space="preserve">                             </w:t>
+      </w:r>
+      <w:r>
+        <w:rPr>
+          <w:rFonts w:eastAsia="Yu Gothic UI Light" w:cstheme="minorHAnsi"/>
+          <w:noProof/>
+          <w:color w:val="171717" w:themeColor="background2" w:themeShade="1A"/>
+          <w:sz w:val="16"/>
+          <w:szCs w:val="16"/>
+          <w:lang w:eastAsia="es-CO"/>
+        </w:rPr>
+        <w:t xml:space="preserve">    </w:t>
+      </w:r>
+      <w:r>
+        <w:rPr>
+          <w:rFonts w:eastAsia="Yu Gothic UI Light" w:cstheme="minorHAnsi"/>
+          <w:noProof/>
+          <w:color w:val="171717" w:themeColor="background2" w:themeShade="1A"/>
+          <w:sz w:val="16"/>
+          <w:szCs w:val="16"/>
+          <w:highlight w:val="yellow"/>
+          <w:lang w:eastAsia="es-CO"/>
+        </w:rPr>
+        <w:t>35,357                       8,293</w:t>
+      </w:r>
+    </w:p>
+    <w:p>
+      <w:pPr>
+        <w:spacing w:after="0" w:line="240" w:lineRule="auto"/>
+        <w:ind w:left="-142"/>
         <w:rPr>
           <w:rFonts w:eastAsia="Yu Gothic UI Light" w:cstheme="minorHAnsi"/>
           <w:noProof/>
@@ -649,6 +827,7 @@
     <w:p>
       <w:pPr>
         <w:spacing w:after="0" w:line="240" w:lineRule="auto"/>
+        <w:ind w:left="-142"/>
         <w:rPr>
           <w:rFonts w:eastAsia="Yu Gothic UI Light" w:cstheme="minorHAnsi"/>
           <w:noProof/>
@@ -673,25 +852,88 @@
     <w:p>
       <w:pPr>
         <w:spacing w:after="0" w:line="240" w:lineRule="auto"/>
-        <w:rPr>
-          <w:rFonts w:eastAsia="Yu Gothic UI Light" w:cstheme="minorHAnsi"/>
-          <w:noProof/>
-          <w:color w:val="171717" w:themeColor="background2" w:themeShade="1A"/>
-          <w:sz w:val="16"/>
-          <w:szCs w:val="16"/>
-          <w:lang w:eastAsia="es-CO"/>
-        </w:rPr>
-      </w:pPr>
-      <w:r>
-        <w:rPr>
-          <w:sz w:val="16"/>
-        </w:rPr>
-        <w:t xml:space="preserve"> TOTAL                              {{ base_total_fmt }}                    {{ impuesto_total_fmt }}</w:t>
-      </w:r>
-    </w:p>
-    <w:p>
-      <w:pPr>
-        <w:spacing w:after="0" w:line="240" w:lineRule="auto"/>
+        <w:ind w:left="-142"/>
+        <w:rPr>
+          <w:rFonts w:eastAsia="Yu Gothic UI Light" w:cstheme="minorHAnsi"/>
+          <w:noProof/>
+          <w:color w:val="171717" w:themeColor="background2" w:themeShade="1A"/>
+          <w:sz w:val="16"/>
+          <w:szCs w:val="16"/>
+          <w:lang w:eastAsia="es-CO"/>
+        </w:rPr>
+      </w:pPr>
+      <w:r>
+        <w:rPr>
+          <w:rFonts w:eastAsia="Yu Gothic UI Light" w:cstheme="minorHAnsi"/>
+          <w:noProof/>
+          <w:color w:val="171717" w:themeColor="background2" w:themeShade="1A"/>
+          <w:sz w:val="16"/>
+          <w:szCs w:val="16"/>
+          <w:lang w:eastAsia="es-CO"/>
+        </w:rPr>
+        <w:t xml:space="preserve"> TOTAL                       </w:t>
+      </w:r>
+      <w:r>
+        <w:rPr>
+          <w:rFonts w:eastAsia="Yu Gothic UI Light" w:cstheme="minorHAnsi"/>
+          <w:noProof/>
+          <w:color w:val="171717" w:themeColor="background2" w:themeShade="1A"/>
+          <w:sz w:val="16"/>
+          <w:szCs w:val="16"/>
+          <w:lang w:eastAsia="es-CO"/>
+        </w:rPr>
+        <w:t xml:space="preserve">  </w:t>
+      </w:r>
+      <w:r>
+        <w:rPr>
+          <w:rFonts w:eastAsia="Yu Gothic UI Light" w:cstheme="minorHAnsi"/>
+          <w:noProof/>
+          <w:color w:val="171717" w:themeColor="background2" w:themeShade="1A"/>
+          <w:sz w:val="16"/>
+          <w:szCs w:val="16"/>
+          <w:lang w:eastAsia="es-CO"/>
+        </w:rPr>
+        <w:t xml:space="preserve"> </w:t>
+      </w:r>
+      <w:r>
+        <w:rPr>
+          <w:rFonts w:eastAsia="Yu Gothic UI Light" w:cstheme="minorHAnsi"/>
+          <w:noProof/>
+          <w:color w:val="171717" w:themeColor="background2" w:themeShade="1A"/>
+          <w:sz w:val="16"/>
+          <w:szCs w:val="16"/>
+          <w:lang w:eastAsia="es-CO"/>
+        </w:rPr>
+        <w:t xml:space="preserve">   </w:t>
+      </w:r>
+      <w:r>
+        <w:rPr>
+          <w:rFonts w:eastAsia="Yu Gothic UI Light" w:cstheme="minorHAnsi"/>
+          <w:noProof/>
+          <w:color w:val="171717" w:themeColor="background2" w:themeShade="1A"/>
+          <w:sz w:val="16"/>
+          <w:szCs w:val="16"/>
+          <w:lang w:eastAsia="es-CO"/>
+        </w:rPr>
+        <w:t xml:space="preserve"> </w:t>
+      </w:r>
+      <w:r>
+        <w:rPr>
+          <w:rFonts w:eastAsia="Yu Gothic UI Light" w:cstheme="minorHAnsi"/>
+          <w:noProof/>
+          <w:color w:val="171717" w:themeColor="background2" w:themeShade="1A"/>
+          <w:sz w:val="16"/>
+          <w:szCs w:val="16"/>
+          <w:highlight w:val="yellow"/>
+          <w:lang w:eastAsia="es-CO"/>
+        </w:rPr>
+        <w:t>43,650                           8,293</w:t>
+      </w:r>
+    </w:p>
+    <w:p>
+      <w:pPr>
+        <w:spacing w:after="0" w:line="240" w:lineRule="auto"/>
+        <w:ind w:left="-142"/>
         <w:jc w:val="center"/>
         <w:rPr>
           <w:rFonts w:eastAsia="Yu Gothic UI Light" w:cstheme="minorHAnsi"/>
@@ -717,6 +959,7 @@
     <w:p>
       <w:pPr>
         <w:spacing w:after="0" w:line="240" w:lineRule="auto"/>
+        <w:ind w:left="-142"/>
         <w:jc w:val="both"/>
         <w:rPr>
           <w:rFonts w:eastAsia="Yu Gothic UI Light" w:cstheme="minorHAnsi"/>
@@ -742,6 +985,7 @@
     <w:p>
       <w:pPr>
         <w:spacing w:after="0" w:line="240" w:lineRule="auto"/>
+        <w:ind w:left="-142"/>
         <w:rPr>
           <w:rFonts w:eastAsia="Yu Gothic UI Light" w:cstheme="minorHAnsi"/>
           <w:noProof/>
@@ -766,6 +1010,7 @@
     <w:p>
       <w:pPr>
         <w:spacing w:after="0" w:line="240" w:lineRule="auto"/>
+        <w:ind w:left="-142"/>
         <w:rPr>
           <w:rFonts w:eastAsia="Yu Gothic UI Light" w:cstheme="minorHAnsi"/>
           <w:noProof/>
@@ -790,6 +1035,7 @@
     <w:p>
       <w:pPr>
         <w:spacing w:after="0" w:line="240" w:lineRule="auto"/>
+        <w:ind w:left="-142"/>
         <w:rPr>
           <w:rFonts w:eastAsia="Yu Gothic UI Light" w:cstheme="minorHAnsi"/>
           <w:noProof/>
@@ -814,6 +1060,7 @@
     <w:p>
       <w:pPr>
         <w:spacing w:after="0" w:line="240" w:lineRule="auto"/>
+        <w:ind w:left="-142"/>
         <w:rPr>
           <w:rFonts w:eastAsia="Yu Gothic UI Light" w:cstheme="minorHAnsi"/>
           <w:noProof/>
@@ -838,6 +1085,7 @@
     <w:p>
       <w:pPr>
         <w:spacing w:after="0" w:line="240" w:lineRule="auto"/>
+        <w:ind w:left="-142"/>
         <w:rPr>
           <w:rFonts w:eastAsia="Yu Gothic UI Light" w:cstheme="minorHAnsi"/>
           <w:noProof/>
@@ -862,6 +1110,7 @@
     <w:p>
       <w:pPr>
         <w:spacing w:after="0" w:line="240" w:lineRule="auto"/>
+        <w:ind w:left="-142"/>
         <w:rPr>
           <w:rFonts w:eastAsia="Yu Gothic UI Light" w:cstheme="minorHAnsi"/>
           <w:noProof/>
@@ -886,6 +1135,7 @@
     <w:p>
       <w:pPr>
         <w:spacing w:after="0" w:line="240" w:lineRule="auto"/>
+        <w:ind w:left="-142"/>
         <w:rPr>
           <w:rFonts w:eastAsia="Yu Gothic UI Light" w:cstheme="minorHAnsi"/>
           <w:noProof/>
@@ -910,6 +1160,7 @@
     <w:p>
       <w:pPr>
         <w:spacing w:after="0" w:line="240" w:lineRule="auto"/>
+        <w:ind w:left="-142"/>
         <w:rPr>
           <w:rFonts w:eastAsia="Yu Gothic UI Light" w:cstheme="minorHAnsi"/>
           <w:noProof/>
@@ -934,6 +1185,7 @@
     <w:p>
       <w:pPr>
         <w:spacing w:after="0" w:line="240" w:lineRule="auto"/>
+        <w:ind w:left="-142"/>
         <w:rPr>
           <w:rFonts w:eastAsia="Yu Gothic UI Light" w:cstheme="minorHAnsi"/>
           <w:noProof/>
@@ -958,18 +1210,24 @@
     <w:p>
       <w:pPr>
         <w:spacing w:after="0" w:line="240" w:lineRule="auto"/>
-        <w:rPr>
-          <w:rFonts w:eastAsia="Yu Gothic UI Light" w:cstheme="minorHAnsi"/>
-          <w:noProof/>
-          <w:color w:val="171717" w:themeColor="background2" w:themeShade="1A"/>
-          <w:sz w:val="16"/>
-          <w:szCs w:val="16"/>
-          <w:lang w:eastAsia="es-CO"/>
-        </w:rPr>
-      </w:pPr>
-      <w:r>
-        <w:rPr>
-          <w:sz w:val="16"/>
+        <w:ind w:left="-142"/>
+        <w:rPr>
+          <w:rFonts w:eastAsia="Yu Gothic UI Light" w:cstheme="minorHAnsi"/>
+          <w:noProof/>
+          <w:color w:val="171717" w:themeColor="background2" w:themeShade="1A"/>
+          <w:sz w:val="16"/>
+          <w:szCs w:val="16"/>
+          <w:lang w:eastAsia="es-CO"/>
+        </w:rPr>
+      </w:pPr>
+      <w:r>
+        <w:rPr>
+          <w:rFonts w:eastAsia="Yu Gothic UI Light" w:cstheme="minorHAnsi"/>
+          <w:noProof/>
+          <w:color w:val="171717" w:themeColor="background2" w:themeShade="1A"/>
+          <w:sz w:val="16"/>
+          <w:szCs w:val="16"/>
+          <w:lang w:eastAsia="es-CO"/>
         </w:rPr>
         <w:t xml:space="preserve">CUFE : </w:t>
       </w:r>
@@ -977,65 +1235,33 @@
     <w:p>
       <w:pPr>
         <w:spacing w:after="0" w:line="240" w:lineRule="auto"/>
-        <w:jc w:val="both"/>
-        <w:rPr>
-          <w:rFonts w:eastAsia="Yu Gothic UI Light" w:cstheme="minorHAnsi"/>
-          <w:noProof/>
-          <w:color w:val="171717" w:themeColor="background2" w:themeShade="1A"/>
-          <w:sz w:val="16"/>
-          <w:szCs w:val="16"/>
-          <w:lang w:eastAsia="es-CO"/>
-        </w:rPr>
-      </w:pPr>
-      <w:r>
-        <w:rPr>
-          <w:sz w:val="16"/>
-        </w:rPr>
-        <w:t>{{ cufe_linea_1 }}</w:t>
-      </w:r>
-    </w:p>
-    <w:p>
-      <w:pPr>
-        <w:spacing w:after="0" w:line="240" w:lineRule="auto"/>
-        <w:jc w:val="both"/>
-        <w:rPr>
-          <w:rFonts w:eastAsia="Yu Gothic UI Light" w:cstheme="minorHAnsi"/>
-          <w:noProof/>
-          <w:color w:val="171717" w:themeColor="background2" w:themeShade="1A"/>
-          <w:sz w:val="16"/>
-          <w:szCs w:val="16"/>
-          <w:lang w:eastAsia="es-CO"/>
-        </w:rPr>
-      </w:pPr>
-      <w:r>
-        <w:rPr>
-          <w:sz w:val="16"/>
-        </w:rPr>
-        <w:t>{{ cufe_linea_2 }}</w:t>
-      </w:r>
-    </w:p>
-    <w:p>
-      <w:pPr>
-        <w:spacing w:after="0" w:line="240" w:lineRule="auto"/>
-        <w:rPr>
-          <w:rFonts w:eastAsia="Yu Gothic UI Light" w:cstheme="minorHAnsi"/>
-          <w:noProof/>
-          <w:color w:val="171717" w:themeColor="background2" w:themeShade="1A"/>
-          <w:sz w:val="16"/>
-          <w:szCs w:val="16"/>
-          <w:lang w:eastAsia="es-CO"/>
-        </w:rPr>
-      </w:pPr>
-      <w:r>
-        <w:rPr>
-          <w:sz w:val="16"/>
-        </w:rPr>
-        <w:t>{{ cufe_linea_3 }}</w:t>
-      </w:r>
-    </w:p>
-    <w:p>
-      <w:pPr>
-        <w:spacing w:after="0" w:line="240" w:lineRule="auto"/>
+        <w:ind w:left="-142"/>
+        <w:rPr>
+          <w:rFonts w:eastAsia="Yu Gothic UI Light" w:cstheme="minorHAnsi"/>
+          <w:noProof/>
+          <w:color w:val="171717" w:themeColor="background2" w:themeShade="1A"/>
+          <w:sz w:val="16"/>
+          <w:szCs w:val="16"/>
+          <w:lang w:eastAsia="es-CO"/>
+        </w:rPr>
+      </w:pPr>
+      <w:r>
+        <w:rPr>
+          <w:rFonts w:eastAsia="Yu Gothic UI Light" w:cstheme="minorHAnsi"/>
+          <w:noProof/>
+          <w:color w:val="171717" w:themeColor="background2" w:themeShade="1A"/>
+          <w:sz w:val="16"/>
+          <w:szCs w:val="16"/>
+          <w:highlight w:val="yellow"/>
+          <w:lang w:eastAsia="es-CO"/>
+        </w:rPr>
+        <w:t>ab2ed23685d24e9f895c4f09d3a8bb2691ad6f5659dd4017af2523ccbcfc859e</w:t>
+      </w:r>
+    </w:p>
+    <w:p>
+      <w:pPr>
+        <w:spacing w:after="0" w:line="240" w:lineRule="auto"/>
+        <w:ind w:left="-142"/>
         <w:jc w:val="center"/>
         <w:rPr>
           <w:rFonts w:eastAsia="Yu Gothic UI Light" w:cstheme="minorHAnsi"/>
@@ -1047,13 +1273,63 @@
         </w:rPr>
       </w:pPr>
       <w:r>
-        <w:rPr/>
-        <w:t>{{ qr }}</w:t>
-      </w:r>
-    </w:p>
-    <w:p>
-      <w:pPr>
-        <w:spacing w:after="0" w:line="240" w:lineRule="auto"/>
+        <w:rPr>
+          <w:noProof/>
+        </w:rPr>
+        <w:drawing>
+          <wp:inline distT="0" distB="0" distL="0" distR="0" wp14:anchorId="3DF41A63" wp14:editId="2A1993C9">
+            <wp:extent cx="1282889" cy="1282889"/>
+            <wp:effectExtent l="0" t="0" r="0" b="0"/>
+            <wp:docPr id="4" name="Imagen 4"/>
+            <wp:cNvGraphicFramePr>
+              <a:graphicFrameLocks xmlns:a="http://schemas.openxmlformats.org/drawingml/2006/main" noChangeAspect="1"/>
+            </wp:cNvGraphicFramePr>
+            <a:graphic xmlns:a="http://schemas.openxmlformats.org/drawingml/2006/main">
+              <a:graphicData uri="http://schemas.openxmlformats.org/drawingml/2006/picture">
+                <pic:pic xmlns:pic="http://schemas.openxmlformats.org/drawingml/2006/picture">
+                  <pic:nvPicPr>
+                    <pic:cNvPr id="0" name="Picture 1"/>
+                    <pic:cNvPicPr>
+                      <a:picLocks noChangeAspect="1" noChangeArrowheads="1"/>
+                    </pic:cNvPicPr>
+                  </pic:nvPicPr>
+                  <pic:blipFill>
+                    <a:blip r:embed="rId8" cstate="print">
+                      <a:extLst>
+                        <a:ext uri="{28A0092B-C50C-407E-A947-70E740481C1C}">
+                          <a14:useLocalDpi xmlns:a14="http://schemas.microsoft.com/office/drawing/2010/main" val="0"/>
+                        </a:ext>
+                      </a:extLst>
+                    </a:blip>
+                    <a:srcRect/>
+                    <a:stretch>
+                      <a:fillRect/>
+                    </a:stretch>
+                  </pic:blipFill>
+                  <pic:spPr bwMode="auto">
+                    <a:xfrm>
+                      <a:off x="0" y="0"/>
+                      <a:ext cx="1296414" cy="1296414"/>
+                    </a:xfrm>
+                    <a:prstGeom prst="rect">
+                      <a:avLst/>
+                    </a:prstGeom>
+                    <a:noFill/>
+                    <a:ln>
+                      <a:noFill/>
+                    </a:ln>
+                  </pic:spPr>
+                </pic:pic>
+              </a:graphicData>
+            </a:graphic>
+          </wp:inline>
+        </w:drawing>
+      </w:r>
+    </w:p>
+    <w:p>
+      <w:pPr>
+        <w:spacing w:after="0" w:line="240" w:lineRule="auto"/>
+        <w:ind w:left="-142"/>
         <w:rPr>
           <w:rFonts w:eastAsia="Yu Gothic UI Light" w:cstheme="minorHAnsi"/>
           <w:noProof/>
@@ -1063,10 +1339,7 @@
           <w:lang w:eastAsia="es-CO"/>
         </w:rPr>
       </w:pPr>
-    </w:p>
-    <w:p>
-      <w:pPr>
-        <w:spacing w:after="0" w:line="240" w:lineRule="auto"/>
+      <w:r>
         <w:rPr>
           <w:rFonts w:eastAsia="Yu Gothic UI Light" w:cstheme="minorHAnsi"/>
           <w:noProof/>
@@ -1075,17 +1348,62 @@
           <w:szCs w:val="20"/>
           <w:lang w:eastAsia="es-CO"/>
         </w:rPr>
-      </w:pPr>
-      <w:r>
-        <w:rPr>
+        <w:t xml:space="preserve">  FACTURADOR  :  </w:t>
+      </w:r>
+      <w:r>
+        <w:rPr>
+          <w:rFonts w:eastAsia="Yu Gothic UI Light" w:cstheme="minorHAnsi"/>
+          <w:noProof/>
+          <w:color w:val="171717" w:themeColor="background2" w:themeShade="1A"/>
           <w:sz w:val="20"/>
-        </w:rPr>
-        <w:t xml:space="preserve">  FACTURADOR  :  {{ serie }}- {{ folio }}   - CUFE </w:t>
-      </w:r>
-    </w:p>
-    <w:p>
-      <w:pPr>
-        <w:spacing w:after="0" w:line="240" w:lineRule="auto"/>
+          <w:szCs w:val="20"/>
+          <w:highlight w:val="yellow"/>
+          <w:lang w:eastAsia="es-CO"/>
+        </w:rPr>
+        <w:t>AU06- 3425557</w:t>
+      </w:r>
+      <w:r>
+        <w:rPr>
+          <w:rFonts w:eastAsia="Yu Gothic UI Light" w:cstheme="minorHAnsi"/>
+          <w:noProof/>
+          <w:color w:val="171717" w:themeColor="background2" w:themeShade="1A"/>
+          <w:sz w:val="20"/>
+          <w:szCs w:val="20"/>
+          <w:lang w:eastAsia="es-CO"/>
+        </w:rPr>
+        <w:t xml:space="preserve">   - CUFE </w:t>
+      </w:r>
+    </w:p>
+    <w:p>
+      <w:pPr>
+        <w:spacing w:after="0" w:line="240" w:lineRule="auto"/>
+        <w:ind w:left="-142"/>
+        <w:rPr>
+          <w:rFonts w:eastAsia="Yu Gothic UI Light" w:cstheme="minorHAnsi"/>
+          <w:noProof/>
+          <w:color w:val="171717" w:themeColor="background2" w:themeShade="1A"/>
+          <w:sz w:val="16"/>
+          <w:szCs w:val="16"/>
+          <w:lang w:eastAsia="es-CO"/>
+        </w:rPr>
+      </w:pPr>
+      <w:r>
+        <w:rPr>
+          <w:rFonts w:eastAsia="Yu Gothic UI Light" w:cstheme="minorHAnsi"/>
+          <w:noProof/>
+          <w:color w:val="171717" w:themeColor="background2" w:themeShade="1A"/>
+          <w:sz w:val="16"/>
+          <w:szCs w:val="16"/>
+          <w:highlight w:val="yellow"/>
+          <w:lang w:eastAsia="es-CO"/>
+        </w:rPr>
+        <w:t>ab2ed23685d24e9f895c4f09d3a8bb2691ad6f5659dd4017af2523ccbcfc859e</w:t>
+      </w:r>
+    </w:p>
+    <w:p>
+      <w:pPr>
+        <w:spacing w:after="0" w:line="240" w:lineRule="auto"/>
+        <w:ind w:left="-142"/>
         <w:jc w:val="both"/>
         <w:rPr>
           <w:rFonts w:eastAsia="Yu Gothic UI Light" w:cstheme="minorHAnsi"/>
@@ -1098,66 +1416,6 @@
       </w:pPr>
       <w:r>
         <w:rPr>
-          <w:sz w:val="20"/>
-        </w:rPr>
-        <w:t xml:space="preserve">  {{ cufe_linea_1 }}</w:t>
-      </w:r>
-    </w:p>
-    <w:p>
-      <w:pPr>
-        <w:spacing w:after="0" w:line="240" w:lineRule="auto"/>
-        <w:jc w:val="both"/>
-        <w:rPr>
-          <w:rFonts w:eastAsia="Yu Gothic UI Light" w:cstheme="minorHAnsi"/>
-          <w:noProof/>
-          <w:color w:val="171717" w:themeColor="background2" w:themeShade="1A"/>
-          <w:sz w:val="16"/>
-          <w:szCs w:val="16"/>
-          <w:lang w:eastAsia="es-CO"/>
-        </w:rPr>
-      </w:pPr>
-      <w:r>
-        <w:rPr>
-          <w:sz w:val="16"/>
-        </w:rPr>
-        <w:t xml:space="preserve">  {{ cufe_linea_2 }}</w:t>
-      </w:r>
-    </w:p>
-    <w:p>
-      <w:pPr>
-        <w:spacing w:after="0" w:line="240" w:lineRule="auto"/>
-        <w:jc w:val="both"/>
-        <w:rPr>
-          <w:rFonts w:eastAsia="Yu Gothic UI Light" w:cstheme="minorHAnsi"/>
-          <w:noProof/>
-          <w:color w:val="171717" w:themeColor="background2" w:themeShade="1A"/>
-          <w:sz w:val="16"/>
-          <w:szCs w:val="16"/>
-          <w:lang w:eastAsia="es-CO"/>
-        </w:rPr>
-      </w:pPr>
-      <w:r>
-        <w:rPr>
-          <w:sz w:val="16"/>
-        </w:rPr>
-        <w:t xml:space="preserve">  {{ cufe_linea_3 }} </w:t>
-      </w:r>
-    </w:p>
-    <w:p>
-      <w:pPr>
-        <w:spacing w:after="0" w:line="240" w:lineRule="auto"/>
-        <w:jc w:val="both"/>
-        <w:rPr>
-          <w:rFonts w:eastAsia="Yu Gothic UI Light" w:cstheme="minorHAnsi"/>
-          <w:noProof/>
-          <w:color w:val="171717" w:themeColor="background2" w:themeShade="1A"/>
-          <w:sz w:val="16"/>
-          <w:szCs w:val="16"/>
-          <w:lang w:eastAsia="es-CO"/>
-        </w:rPr>
-      </w:pPr>
-      <w:r>
-        <w:rPr>
           <w:rFonts w:eastAsia="Yu Gothic UI Light" w:cstheme="minorHAnsi"/>
           <w:noProof/>
           <w:color w:val="171717" w:themeColor="background2" w:themeShade="1A"/>
@@ -1171,6 +1429,7 @@
     <w:p>
       <w:pPr>
         <w:spacing w:after="0" w:line="240" w:lineRule="auto"/>
+        <w:ind w:left="-142"/>
         <w:rPr>
           <w:rFonts w:eastAsia="Yu Gothic UI Light" w:cstheme="minorHAnsi"/>
           <w:noProof/>
@@ -1195,6 +1454,7 @@
     <w:p>
       <w:pPr>
         <w:spacing w:after="0" w:line="240" w:lineRule="auto"/>
+        <w:ind w:left="-142"/>
         <w:rPr>
           <w:rFonts w:eastAsia="Yu Gothic UI Light" w:cstheme="minorHAnsi"/>
           <w:noProof/>
@@ -1219,82 +1479,163 @@
     <w:p>
       <w:pPr>
         <w:spacing w:after="0" w:line="240" w:lineRule="auto"/>
-        <w:rPr>
-          <w:rFonts w:eastAsia="Yu Gothic UI Light" w:cstheme="minorHAnsi"/>
-          <w:noProof/>
-          <w:color w:val="171717" w:themeColor="background2" w:themeShade="1A"/>
-          <w:sz w:val="16"/>
-          <w:szCs w:val="16"/>
-          <w:lang w:eastAsia="es-CO"/>
-        </w:rPr>
-      </w:pPr>
-      <w:r>
-        <w:rPr>
-          <w:sz w:val="16"/>
-        </w:rPr>
-        <w:t xml:space="preserve">                {{ numero_autorizacion }}       {{ fecha_resolucion_larga }} </w:t>
-      </w:r>
-    </w:p>
-    <w:p>
-      <w:pPr>
-        <w:spacing w:after="0" w:line="240" w:lineRule="auto"/>
-        <w:rPr>
-          <w:rFonts w:eastAsia="Yu Gothic UI Light" w:cstheme="minorHAnsi"/>
-          <w:noProof/>
-          <w:color w:val="171717" w:themeColor="background2" w:themeShade="1A"/>
-          <w:sz w:val="16"/>
-          <w:szCs w:val="16"/>
-          <w:lang w:eastAsia="es-CO"/>
-        </w:rPr>
-      </w:pPr>
-      <w:r>
-        <w:rPr>
-          <w:sz w:val="16"/>
-        </w:rPr>
-        <w:t xml:space="preserve">                          VIGENCIA :       {{ vigencia_meses }} MESES </w:t>
-      </w:r>
-    </w:p>
-    <w:p>
-      <w:pPr>
-        <w:spacing w:after="0" w:line="240" w:lineRule="auto"/>
-        <w:rPr>
-          <w:rFonts w:eastAsia="Yu Gothic UI Light" w:cstheme="minorHAnsi"/>
-          <w:noProof/>
-          <w:color w:val="171717" w:themeColor="background2" w:themeShade="1A"/>
-          <w:sz w:val="16"/>
-          <w:szCs w:val="16"/>
-          <w:lang w:eastAsia="es-CO"/>
-        </w:rPr>
-      </w:pPr>
-      <w:r>
-        <w:rPr>
-          <w:sz w:val="16"/>
-        </w:rPr>
-        <w:t xml:space="preserve">        PREF.   {{ serie }}  {{ rango_desde }} - {{ rango_hasta }}</w:t>
-      </w:r>
-    </w:p>
-    <w:p>
-      <w:pPr>
-        <w:spacing w:after="0" w:line="240" w:lineRule="auto"/>
-        <w:rPr>
-          <w:rFonts w:eastAsia="Yu Gothic UI Light" w:cstheme="minorHAnsi"/>
-          <w:noProof/>
-          <w:color w:val="171717" w:themeColor="background2" w:themeShade="1A"/>
-          <w:sz w:val="16"/>
-          <w:szCs w:val="16"/>
-          <w:lang w:eastAsia="es-CO"/>
-        </w:rPr>
-      </w:pPr>
-      <w:r>
-        <w:rPr>
-          <w:sz w:val="16"/>
-        </w:rPr>
-        <w:t xml:space="preserve">   FAC.    ELECTRONICA   DE  VENTA  {{ serie }}  {{ folio }}</w:t>
-      </w:r>
-    </w:p>
-    <w:p>
-      <w:pPr>
-        <w:spacing w:after="0" w:line="240" w:lineRule="auto"/>
+        <w:ind w:left="-142"/>
+        <w:rPr>
+          <w:rFonts w:eastAsia="Yu Gothic UI Light" w:cstheme="minorHAnsi"/>
+          <w:noProof/>
+          <w:color w:val="171717" w:themeColor="background2" w:themeShade="1A"/>
+          <w:sz w:val="16"/>
+          <w:szCs w:val="16"/>
+          <w:lang w:eastAsia="es-CO"/>
+        </w:rPr>
+      </w:pPr>
+      <w:r>
+        <w:rPr>
+          <w:rFonts w:eastAsia="Yu Gothic UI Light" w:cstheme="minorHAnsi"/>
+          <w:noProof/>
+          <w:color w:val="171717" w:themeColor="background2" w:themeShade="1A"/>
+          <w:sz w:val="16"/>
+          <w:szCs w:val="16"/>
+          <w:lang w:eastAsia="es-CO"/>
+        </w:rPr>
+        <w:t xml:space="preserve">                187640957</w:t>
+      </w:r>
+      <w:r>
+        <w:rPr>
+          <w:rFonts w:eastAsia="Yu Gothic UI Light" w:cstheme="minorHAnsi"/>
+          <w:noProof/>
+          <w:color w:val="171717" w:themeColor="background2" w:themeShade="1A"/>
+          <w:sz w:val="16"/>
+          <w:szCs w:val="16"/>
+          <w:lang w:eastAsia="es-CO"/>
+        </w:rPr>
+        <w:t>25499</w:t>
+      </w:r>
+      <w:r>
+        <w:rPr>
+          <w:rFonts w:eastAsia="Yu Gothic UI Light" w:cstheme="minorHAnsi"/>
+          <w:noProof/>
+          <w:color w:val="171717" w:themeColor="background2" w:themeShade="1A"/>
+          <w:sz w:val="16"/>
+          <w:szCs w:val="16"/>
+          <w:lang w:eastAsia="es-CO"/>
+        </w:rPr>
+        <w:t xml:space="preserve">       16   JULIO    202</w:t>
+      </w:r>
+      <w:r>
+        <w:rPr>
+          <w:rFonts w:eastAsia="Yu Gothic UI Light" w:cstheme="minorHAnsi"/>
+          <w:noProof/>
+          <w:color w:val="171717" w:themeColor="background2" w:themeShade="1A"/>
+          <w:sz w:val="16"/>
+          <w:szCs w:val="16"/>
+          <w:lang w:eastAsia="es-CO"/>
+        </w:rPr>
+        <w:t>6</w:t>
+      </w:r>
+      <w:r>
+        <w:rPr>
+          <w:rFonts w:eastAsia="Yu Gothic UI Light" w:cstheme="minorHAnsi"/>
+          <w:noProof/>
+          <w:color w:val="171717" w:themeColor="background2" w:themeShade="1A"/>
+          <w:sz w:val="16"/>
+          <w:szCs w:val="16"/>
+          <w:lang w:eastAsia="es-CO"/>
+        </w:rPr>
+        <w:t xml:space="preserve"> </w:t>
+      </w:r>
+    </w:p>
+    <w:p>
+      <w:pPr>
+        <w:spacing w:after="0" w:line="240" w:lineRule="auto"/>
+        <w:ind w:left="-142"/>
+        <w:rPr>
+          <w:rFonts w:eastAsia="Yu Gothic UI Light" w:cstheme="minorHAnsi"/>
+          <w:noProof/>
+          <w:color w:val="171717" w:themeColor="background2" w:themeShade="1A"/>
+          <w:sz w:val="16"/>
+          <w:szCs w:val="16"/>
+          <w:lang w:eastAsia="es-CO"/>
+        </w:rPr>
+      </w:pPr>
+      <w:r>
+        <w:rPr>
+          <w:rFonts w:eastAsia="Yu Gothic UI Light" w:cstheme="minorHAnsi"/>
+          <w:noProof/>
+          <w:color w:val="171717" w:themeColor="background2" w:themeShade="1A"/>
+          <w:sz w:val="16"/>
+          <w:szCs w:val="16"/>
+          <w:lang w:eastAsia="es-CO"/>
+        </w:rPr>
+        <w:t xml:space="preserve">                          VIGENCIA :       18 MESES </w:t>
+      </w:r>
+    </w:p>
+    <w:p>
+      <w:pPr>
+        <w:spacing w:after="0" w:line="240" w:lineRule="auto"/>
+        <w:ind w:left="-142"/>
+        <w:rPr>
+          <w:rFonts w:eastAsia="Yu Gothic UI Light" w:cstheme="minorHAnsi"/>
+          <w:noProof/>
+          <w:color w:val="171717" w:themeColor="background2" w:themeShade="1A"/>
+          <w:sz w:val="16"/>
+          <w:szCs w:val="16"/>
+          <w:lang w:eastAsia="es-CO"/>
+        </w:rPr>
+      </w:pPr>
+      <w:r>
+        <w:rPr>
+          <w:rFonts w:eastAsia="Yu Gothic UI Light" w:cstheme="minorHAnsi"/>
+          <w:noProof/>
+          <w:color w:val="171717" w:themeColor="background2" w:themeShade="1A"/>
+          <w:sz w:val="16"/>
+          <w:szCs w:val="16"/>
+          <w:lang w:eastAsia="es-CO"/>
+        </w:rPr>
+        <w:t xml:space="preserve">        PREF.   AU06  0001055859 - 0009999999</w:t>
+      </w:r>
+    </w:p>
+    <w:p>
+      <w:pPr>
+        <w:spacing w:after="0" w:line="240" w:lineRule="auto"/>
+        <w:ind w:left="-142"/>
+        <w:rPr>
+          <w:rFonts w:eastAsia="Yu Gothic UI Light" w:cstheme="minorHAnsi"/>
+          <w:noProof/>
+          <w:color w:val="171717" w:themeColor="background2" w:themeShade="1A"/>
+          <w:sz w:val="16"/>
+          <w:szCs w:val="16"/>
+          <w:lang w:eastAsia="es-CO"/>
+        </w:rPr>
+      </w:pPr>
+      <w:r>
+        <w:rPr>
+          <w:rFonts w:eastAsia="Yu Gothic UI Light" w:cstheme="minorHAnsi"/>
+          <w:noProof/>
+          <w:color w:val="171717" w:themeColor="background2" w:themeShade="1A"/>
+          <w:sz w:val="16"/>
+          <w:szCs w:val="16"/>
+          <w:lang w:eastAsia="es-CO"/>
+        </w:rPr>
+        <w:t xml:space="preserve">   FAC.    ELECTRONICA   DE  VENTA  </w:t>
+      </w:r>
+      <w:r>
+        <w:rPr>
+          <w:rFonts w:eastAsia="Yu Gothic UI Light" w:cstheme="minorHAnsi"/>
+          <w:noProof/>
+          <w:color w:val="171717" w:themeColor="background2" w:themeShade="1A"/>
+          <w:sz w:val="16"/>
+          <w:szCs w:val="16"/>
+          <w:highlight w:val="yellow"/>
+          <w:lang w:eastAsia="es-CO"/>
+        </w:rPr>
+        <w:t>AU06  3425557</w:t>
+      </w:r>
+    </w:p>
+    <w:p>
+      <w:pPr>
+        <w:spacing w:after="0" w:line="240" w:lineRule="auto"/>
+        <w:ind w:left="-142"/>
         <w:rPr>
           <w:rFonts w:eastAsia="Yu Gothic UI Light" w:cstheme="minorHAnsi"/>
           <w:noProof/>
@@ -1319,6 +1660,7 @@
     <w:p>
       <w:pPr>
         <w:spacing w:after="0" w:line="240" w:lineRule="auto"/>
+        <w:ind w:left="-142"/>
         <w:rPr>
           <w:rFonts w:eastAsia="Yu Gothic UI Light" w:cstheme="minorHAnsi"/>
           <w:noProof/>
@@ -1343,6 +1685,7 @@
     <w:p>
       <w:pPr>
         <w:spacing w:after="0" w:line="240" w:lineRule="auto"/>
+        <w:ind w:left="-142"/>
         <w:rPr>
           <w:rFonts w:eastAsia="Yu Gothic UI Light" w:cstheme="minorHAnsi"/>
           <w:noProof/>
@@ -1367,6 +1710,7 @@
     <w:p>
       <w:pPr>
         <w:spacing w:after="0" w:line="240" w:lineRule="auto"/>
+        <w:ind w:left="-142"/>
         <w:rPr>
           <w:rFonts w:eastAsia="Yu Gothic UI Light" w:cstheme="minorHAnsi"/>
           <w:noProof/>
@@ -1391,6 +1735,7 @@
     <w:p>
       <w:pPr>
         <w:spacing w:after="0" w:line="240" w:lineRule="auto"/>
+        <w:ind w:left="-142"/>
         <w:rPr>
           <w:rFonts w:eastAsia="Yu Gothic UI Light" w:cstheme="minorHAnsi"/>
           <w:noProof/>
@@ -1415,6 +1760,7 @@
     <w:p>
       <w:pPr>
         <w:spacing w:after="0" w:line="240" w:lineRule="auto"/>
+        <w:ind w:left="-142"/>
         <w:rPr>
           <w:rFonts w:eastAsia="Yu Gothic UI Light" w:cstheme="minorHAnsi"/>
           <w:noProof/>
@@ -1439,6 +1785,7 @@
     <w:p>
       <w:pPr>
         <w:spacing w:after="0" w:line="240" w:lineRule="auto"/>
+        <w:ind w:left="-142"/>
         <w:rPr>
           <w:rFonts w:eastAsia="Yu Gothic UI Light" w:cstheme="minorHAnsi"/>
           <w:noProof/>
@@ -1463,6 +1810,7 @@
     <w:p>
       <w:pPr>
         <w:spacing w:after="0" w:line="240" w:lineRule="auto"/>
+        <w:ind w:left="-142"/>
         <w:rPr>
           <w:rFonts w:eastAsia="Yu Gothic UI Light" w:cstheme="minorHAnsi"/>
           <w:noProof/>
@@ -1487,6 +1835,7 @@
     <w:p>
       <w:pPr>
         <w:spacing w:after="0" w:line="240" w:lineRule="auto"/>
+        <w:ind w:left="-142"/>
         <w:rPr>
           <w:rFonts w:eastAsia="Yu Gothic UI Light" w:cstheme="minorHAnsi"/>
           <w:noProof/>
@@ -1511,34 +1860,135 @@
     <w:p>
       <w:pPr>
         <w:spacing w:after="0" w:line="240" w:lineRule="auto"/>
-        <w:rPr>
-          <w:rFonts w:eastAsia="Yu Gothic UI Light" w:cstheme="minorHAnsi"/>
-          <w:noProof/>
-          <w:color w:val="171717" w:themeColor="background2" w:themeShade="1A"/>
-          <w:sz w:val="16"/>
-          <w:szCs w:val="16"/>
-          <w:lang w:eastAsia="es-CO"/>
-        </w:rPr>
-      </w:pPr>
-      <w:r>
-        <w:rPr>
-          <w:sz w:val="16"/>
-        </w:rPr>
-        <w:t xml:space="preserve">                                  {{ cajero }} </w:t>
-      </w:r>
-    </w:p>
-    <w:p>
-      <w:pPr>
-        <w:spacing w:after="0" w:line="240" w:lineRule="auto"/>
-        <w:rPr>
-          <w:rFonts w:eastAsia="Yu Gothic UI Light" w:cstheme="minorHAnsi"/>
-          <w:noProof/>
-          <w:color w:val="171717" w:themeColor="background2" w:themeShade="1A"/>
-          <w:sz w:val="16"/>
-          <w:szCs w:val="16"/>
-          <w:lang w:eastAsia="es-CO"/>
-        </w:rPr>
-      </w:pPr>
+        <w:ind w:left="-142"/>
+        <w:rPr>
+          <w:rFonts w:eastAsia="Yu Gothic UI Light" w:cstheme="minorHAnsi"/>
+          <w:noProof/>
+          <w:color w:val="171717" w:themeColor="background2" w:themeShade="1A"/>
+          <w:sz w:val="16"/>
+          <w:szCs w:val="16"/>
+          <w:lang w:eastAsia="es-CO"/>
+        </w:rPr>
+      </w:pPr>
+      <w:r>
+        <w:rPr>
+          <w:rFonts w:eastAsia="Yu Gothic UI Light" w:cstheme="minorHAnsi"/>
+          <w:noProof/>
+          <w:color w:val="171717" w:themeColor="background2" w:themeShade="1A"/>
+          <w:sz w:val="16"/>
+          <w:szCs w:val="16"/>
+          <w:lang w:eastAsia="es-CO"/>
+        </w:rPr>
+        <w:t xml:space="preserve">                                  </w:t>
+      </w:r>
+      <w:r>
+        <w:rPr>
+          <w:rFonts w:eastAsia="Yu Gothic UI Light" w:cstheme="minorHAnsi"/>
+          <w:noProof/>
+          <w:color w:val="171717" w:themeColor="background2" w:themeShade="1A"/>
+          <w:sz w:val="16"/>
+          <w:szCs w:val="16"/>
+          <w:lang w:eastAsia="es-CO"/>
+        </w:rPr>
+        <w:t>CAJERO 222222222</w:t>
+      </w:r>
+    </w:p>
+    <w:p>
+      <w:pPr>
+        <w:spacing w:after="0" w:line="240" w:lineRule="auto"/>
+        <w:ind w:left="-142"/>
+        <w:rPr>
+          <w:rFonts w:eastAsia="Yu Gothic UI Light" w:cstheme="minorHAnsi"/>
+          <w:noProof/>
+          <w:color w:val="171717" w:themeColor="background2" w:themeShade="1A"/>
+          <w:sz w:val="16"/>
+          <w:szCs w:val="16"/>
+          <w:lang w:eastAsia="es-CO"/>
+        </w:rPr>
+      </w:pPr>
+      <w:r>
+        <w:rPr>
+          <w:rFonts w:eastAsia="Yu Gothic UI Light" w:cstheme="minorHAnsi"/>
+          <w:noProof/>
+          <w:color w:val="171717" w:themeColor="background2" w:themeShade="1A"/>
+          <w:sz w:val="16"/>
+          <w:szCs w:val="16"/>
+          <w:highlight w:val="yellow"/>
+          <w:lang w:eastAsia="es-CO"/>
+        </w:rPr>
+        <w:t>10</w:t>
+      </w:r>
+      <w:r>
+        <w:rPr>
+          <w:rFonts w:eastAsia="Yu Gothic UI Light" w:cstheme="minorHAnsi"/>
+          <w:noProof/>
+          <w:color w:val="171717" w:themeColor="background2" w:themeShade="1A"/>
+          <w:sz w:val="16"/>
+          <w:szCs w:val="16"/>
+          <w:highlight w:val="yellow"/>
+          <w:lang w:eastAsia="es-CO"/>
+        </w:rPr>
+        <w:t xml:space="preserve"> : </w:t>
+      </w:r>
+      <w:r>
+        <w:rPr>
+          <w:rFonts w:eastAsia="Yu Gothic UI Light" w:cstheme="minorHAnsi"/>
+          <w:noProof/>
+          <w:color w:val="171717" w:themeColor="background2" w:themeShade="1A"/>
+          <w:sz w:val="16"/>
+          <w:szCs w:val="16"/>
+          <w:highlight w:val="yellow"/>
+          <w:lang w:eastAsia="es-CO"/>
+        </w:rPr>
+        <w:t>21</w:t>
+      </w:r>
+      <w:r>
+        <w:rPr>
+          <w:rFonts w:eastAsia="Yu Gothic UI Light" w:cstheme="minorHAnsi"/>
+          <w:noProof/>
+          <w:color w:val="171717" w:themeColor="background2" w:themeShade="1A"/>
+          <w:sz w:val="16"/>
+          <w:szCs w:val="16"/>
+          <w:highlight w:val="yellow"/>
+          <w:lang w:eastAsia="es-CO"/>
+        </w:rPr>
+        <w:t xml:space="preserve">      </w:t>
+      </w:r>
+      <w:r>
+        <w:rPr>
+          <w:rFonts w:eastAsia="Yu Gothic UI Light" w:cstheme="minorHAnsi"/>
+          <w:noProof/>
+          <w:color w:val="171717" w:themeColor="background2" w:themeShade="1A"/>
+          <w:sz w:val="16"/>
+          <w:szCs w:val="16"/>
+          <w:highlight w:val="yellow"/>
+          <w:lang w:eastAsia="es-CO"/>
+        </w:rPr>
+        <w:t>01</w:t>
+      </w:r>
+      <w:r>
+        <w:rPr>
+          <w:rFonts w:eastAsia="Yu Gothic UI Light" w:cstheme="minorHAnsi"/>
+          <w:noProof/>
+          <w:color w:val="171717" w:themeColor="background2" w:themeShade="1A"/>
+          <w:sz w:val="16"/>
+          <w:szCs w:val="16"/>
+          <w:highlight w:val="yellow"/>
+          <w:lang w:eastAsia="es-CO"/>
+        </w:rPr>
+        <w:t>/ 10/ 26</w:t>
+      </w:r>
+      <w:r>
+        <w:rPr>
+          <w:rFonts w:eastAsia="Yu Gothic UI Light" w:cstheme="minorHAnsi"/>
+          <w:noProof/>
+          <w:color w:val="171717" w:themeColor="background2" w:themeShade="1A"/>
+          <w:sz w:val="16"/>
+          <w:szCs w:val="16"/>
+          <w:lang w:eastAsia="es-CO"/>
+        </w:rPr>
+        <w:t xml:space="preserve">      ST</w:t>
+      </w:r>
       <m:oMath>
         <m:r>
           <w:rPr>
@@ -1554,14 +2004,76 @@
       </m:oMath>
       <w:r>
         <w:rPr>
-          <w:sz w:val="16"/>
-        </w:rPr>
-        <w:t>{{ fecha_hora_operacion }}      ST {{ st }} RG#{{ rg }}       TR#{{ tr }}</w:t>
-      </w:r>
-    </w:p>
-    <w:p>
-      <w:pPr>
-        <w:spacing w:after="0" w:line="240" w:lineRule="auto"/>
+          <w:rFonts w:eastAsia="Yu Gothic UI Light" w:cstheme="minorHAnsi"/>
+          <w:noProof/>
+          <w:color w:val="171717" w:themeColor="background2" w:themeShade="1A"/>
+          <w:sz w:val="16"/>
+          <w:szCs w:val="16"/>
+          <w:lang w:eastAsia="es-CO"/>
+        </w:rPr>
+        <w:t xml:space="preserve"> 10</w:t>
+      </w:r>
+      <w:r>
+        <w:rPr>
+          <w:rFonts w:eastAsia="Yu Gothic UI Light" w:cstheme="minorHAnsi"/>
+          <w:noProof/>
+          <w:color w:val="171717" w:themeColor="background2" w:themeShade="1A"/>
+          <w:sz w:val="16"/>
+          <w:szCs w:val="16"/>
+          <w:lang w:eastAsia="es-CO"/>
+        </w:rPr>
+        <w:t>34</w:t>
+      </w:r>
+      <w:r>
+        <w:rPr>
+          <w:rFonts w:eastAsia="Yu Gothic UI Light" w:cstheme="minorHAnsi"/>
+          <w:noProof/>
+          <w:color w:val="171717" w:themeColor="background2" w:themeShade="1A"/>
+          <w:sz w:val="16"/>
+          <w:szCs w:val="16"/>
+          <w:lang w:eastAsia="es-CO"/>
+        </w:rPr>
+        <w:t xml:space="preserve"> RG#0</w:t>
+      </w:r>
+      <w:r>
+        <w:rPr>
+          <w:rFonts w:eastAsia="Yu Gothic UI Light" w:cstheme="minorHAnsi"/>
+          <w:noProof/>
+          <w:color w:val="171717" w:themeColor="background2" w:themeShade="1A"/>
+          <w:sz w:val="16"/>
+          <w:szCs w:val="16"/>
+          <w:lang w:eastAsia="es-CO"/>
+        </w:rPr>
+        <w:t>5</w:t>
+      </w:r>
+      <w:r>
+        <w:rPr>
+          <w:rFonts w:eastAsia="Yu Gothic UI Light" w:cstheme="minorHAnsi"/>
+          <w:noProof/>
+          <w:color w:val="171717" w:themeColor="background2" w:themeShade="1A"/>
+          <w:sz w:val="16"/>
+          <w:szCs w:val="16"/>
+          <w:lang w:eastAsia="es-CO"/>
+        </w:rPr>
+        <w:t xml:space="preserve">       TR#</w:t>
+      </w:r>
+      <w:r>
+        <w:rPr>
+          <w:rFonts w:eastAsia="Yu Gothic UI Light" w:cstheme="minorHAnsi"/>
+          <w:noProof/>
+          <w:color w:val="171717" w:themeColor="background2" w:themeShade="1A"/>
+          <w:sz w:val="16"/>
+          <w:szCs w:val="16"/>
+          <w:highlight w:val="yellow"/>
+          <w:lang w:eastAsia="es-CO"/>
+        </w:rPr>
+        <w:t>9983</w:t>
+      </w:r>
+    </w:p>
+    <w:p>
+      <w:pPr>
+        <w:spacing w:after="0" w:line="240" w:lineRule="auto"/>
+        <w:ind w:left="-142"/>
         <w:rPr>
           <w:rFonts w:eastAsia="Yu Gothic UI Light" w:cstheme="minorHAnsi"/>
           <w:b/>
@@ -1575,14 +2087,60 @@
       </w:pPr>
       <w:r>
         <w:rPr>
-          <w:sz w:val="16"/>
-        </w:rPr>
-        <w:t xml:space="preserve">                {{ rem }}</w:t>
-      </w:r>
-    </w:p>
-    <w:p>
-      <w:pPr>
-        <w:spacing w:after="0" w:line="240" w:lineRule="auto"/>
+          <w:rFonts w:eastAsia="Yu Gothic UI Light" w:cstheme="minorHAnsi"/>
+          <w:noProof/>
+          <w:color w:val="171717" w:themeColor="background2" w:themeShade="1A"/>
+          <w:sz w:val="16"/>
+          <w:szCs w:val="16"/>
+          <w:lang w:eastAsia="es-CO"/>
+        </w:rPr>
+        <w:t xml:space="preserve">                </w:t>
+      </w:r>
+      <w:r>
+        <w:rPr>
+          <w:rFonts w:eastAsia="Yu Gothic UI Light" w:cstheme="minorHAnsi"/>
+          <w:b/>
+          <w:bCs/>
+          <w:noProof/>
+          <w:color w:val="171717" w:themeColor="background2" w:themeShade="1A"/>
+          <w:sz w:val="28"/>
+          <w:szCs w:val="28"/>
+          <w:lang w:eastAsia="es-CO"/>
+        </w:rPr>
+        <w:t>REM09</w:t>
+      </w:r>
+      <w:r>
+        <w:rPr>
+          <w:rFonts w:eastAsia="Yu Gothic UI Light" w:cstheme="minorHAnsi"/>
+          <w:b/>
+          <w:bCs/>
+          <w:noProof/>
+          <w:color w:val="171717" w:themeColor="background2" w:themeShade="1A"/>
+          <w:sz w:val="28"/>
+          <w:szCs w:val="28"/>
+          <w:lang w:eastAsia="es-CO"/>
+        </w:rPr>
+        <w:t>5</w:t>
+      </w:r>
+      <w:r>
+        <w:rPr>
+          <w:rFonts w:eastAsia="Yu Gothic UI Light" w:cstheme="minorHAnsi"/>
+          <w:b/>
+          <w:bCs/>
+          <w:noProof/>
+          <w:color w:val="171717" w:themeColor="background2" w:themeShade="1A"/>
+          <w:sz w:val="28"/>
+          <w:szCs w:val="28"/>
+          <w:highlight w:val="yellow"/>
+          <w:lang w:eastAsia="es-CO"/>
+        </w:rPr>
+        <w:t>96</w:t>
+      </w:r>
+    </w:p>
+    <w:p>
+      <w:pPr>
+        <w:spacing w:after="0" w:line="240" w:lineRule="auto"/>
+        <w:ind w:left="-142"/>
         <w:rPr>
           <w:rFonts w:eastAsia="Yu Gothic UI Light" w:cstheme="minorHAnsi"/>
           <w:noProof/>
@@ -1607,6 +2165,7 @@
     <w:p>
       <w:pPr>
         <w:spacing w:after="0" w:line="240" w:lineRule="auto"/>
+        <w:ind w:left="-142"/>
         <w:rPr>
           <w:rFonts w:eastAsia="Yu Gothic UI Light" w:cstheme="minorHAnsi"/>
           <w:noProof/>
@@ -1631,6 +2190,7 @@
     <w:p>
       <w:pPr>
         <w:spacing w:after="0" w:line="240" w:lineRule="auto"/>
+        <w:ind w:left="-142"/>
         <w:jc w:val="center"/>
         <w:rPr>
           <w:rFonts w:eastAsia="Yu Gothic UI Light" w:cstheme="minorHAnsi"/>
@@ -1642,13 +2202,57 @@
         </w:rPr>
       </w:pPr>
       <w:r>
-        <w:rPr/>
-        <w:t>{{ barcode }}</w:t>
-      </w:r>
-    </w:p>
-    <w:p>
-      <w:pPr>
-        <w:spacing w:after="0" w:line="240" w:lineRule="auto"/>
+        <w:rPr>
+          <w:noProof/>
+        </w:rPr>
+        <w:drawing>
+          <wp:inline distT="0" distB="0" distL="0" distR="0" wp14:anchorId="2C081071" wp14:editId="4C6B8E06">
+            <wp:extent cx="1341224" cy="285750"/>
+            <wp:effectExtent l="0" t="0" r="0" b="0"/>
+            <wp:docPr id="3" name="Imagen 3"/>
+            <wp:cNvGraphicFramePr>
+              <a:graphicFrameLocks xmlns:a="http://schemas.openxmlformats.org/drawingml/2006/main" noChangeAspect="1"/>
+            </wp:cNvGraphicFramePr>
+            <a:graphic xmlns:a="http://schemas.openxmlformats.org/drawingml/2006/main">
+              <a:graphicData uri="http://schemas.openxmlformats.org/drawingml/2006/picture">
+                <pic:pic xmlns:pic="http://schemas.openxmlformats.org/drawingml/2006/picture">
+                  <pic:nvPicPr>
+                    <pic:cNvPr id="1" name=""/>
+                    <pic:cNvPicPr/>
+                  </pic:nvPicPr>
+                  <pic:blipFill rotWithShape="1">
+                    <a:blip r:embed="rId9"/>
+                    <a:srcRect l="38536" t="35859" r="24284" b="52187"/>
+                    <a:stretch/>
+                  </pic:blipFill>
+                  <pic:spPr bwMode="auto">
+                    <a:xfrm>
+                      <a:off x="0" y="0"/>
+                      <a:ext cx="1588399" cy="338411"/>
+                    </a:xfrm>
+                    <a:prstGeom prst="rect">
+                      <a:avLst/>
+                    </a:prstGeom>
+                    <a:ln>
+                      <a:noFill/>
+                    </a:ln>
+                    <a:extLst>
+                      <a:ext uri="{53640926-AAD7-44D8-BBD7-CCE9431645EC}">
+                        <a14:shadowObscured xmlns:a14="http://schemas.microsoft.com/office/drawing/2010/main"/>
+                      </a:ext>
+                    </a:extLst>
+                  </pic:spPr>
+                </pic:pic>
+              </a:graphicData>
+            </a:graphic>
+          </wp:inline>
+        </w:drawing>
+      </w:r>
+    </w:p>
+    <w:p>
+      <w:pPr>
+        <w:spacing w:after="0" w:line="240" w:lineRule="auto"/>
+        <w:ind w:left="-142"/>
         <w:jc w:val="center"/>
         <w:rPr>
           <w:rFonts w:eastAsia="Arial Unicode MS" w:cstheme="minorHAnsi"/>
@@ -1661,9 +2265,25 @@
         </w:rPr>
       </w:pPr>
     </w:p>
+    <w:p>
+      <w:pPr>
+        <w:spacing w:after="0" w:line="240" w:lineRule="auto"/>
+        <w:ind w:left="-142"/>
+        <w:jc w:val="center"/>
+        <w:rPr>
+          <w:rFonts w:eastAsia="Arial Unicode MS" w:cstheme="minorHAnsi"/>
+          <w:b/>
+          <w:noProof/>
+          <w:color w:val="171717" w:themeColor="background2" w:themeShade="1A"/>
+          <w:sz w:val="16"/>
+          <w:szCs w:val="16"/>
+          <w:lang w:eastAsia="es-CO"/>
+        </w:rPr>
+      </w:pPr>
+    </w:p>
     <w:sectPr>
       <w:pgSz w:w="4536" w:h="17010"/>
-      <w:pgMar w:top="426" w:right="284" w:bottom="142" w:left="284" w:header="709" w:footer="709" w:gutter="0"/>
+      <w:pgMar w:top="284" w:right="255" w:bottom="284" w:left="284" w:header="709" w:footer="709" w:gutter="0"/>
       <w:cols w:space="708"/>
       <w:docGrid w:linePitch="360"/>
     </w:sectPr>
@@ -2216,7 +2836,7 @@
   <w:style w:type="paragraph" w:default="1" w:styleId="Normal">
     <w:name w:val="Normal"/>
     <w:qFormat/>
-    <w:rsid w:val="000250D5"/>
+    <w:rsid w:val="00992C0C"/>
   </w:style>
   <w:style w:type="paragraph" w:styleId="Ttulo1">
     <w:name w:val="heading 1"/>

</xml_diff>